<commit_message>
mods to first draft
addition of second section
</commit_message>
<xml_diff>
--- a/Proposal to Install Semaphore Signal.docx
+++ b/Proposal to Install Semaphore Signal.docx
@@ -46,6 +46,10 @@
     <w:p>
       <w:pPr>
         <w:pStyle w:val="Heading5"/>
+        <w:numPr>
+          <w:ilvl w:val="0"/>
+          <w:numId w:val="2"/>
+        </w:numPr>
         <w:rPr>
           <w:b/>
           <w:lang w:val="en-US"/>
@@ -69,234 +73,81 @@
     </w:p>
     <w:p>
       <w:pPr>
-        <w:rPr>
-          <w:lang w:val="en-US"/>
-        </w:rPr>
-      </w:pPr>
+        <w:autoSpaceDE w:val="0"/>
+        <w:autoSpaceDN w:val="0"/>
+        <w:adjustRightInd w:val="0"/>
+        <w:rPr>
+          <w:rFonts w:ascii="Calibri" w:hAnsi="Calibri" w:cs="Calibri"/>
+        </w:rPr>
+      </w:pPr>
+      <w:proofErr w:type="gramStart"/>
+      <w:r>
+        <w:rPr>
+          <w:rFonts w:ascii="Calibri" w:hAnsi="Calibri" w:cs="Calibri"/>
+        </w:rPr>
+        <w:t xml:space="preserve">The disused </w:t>
+      </w:r>
       <w:proofErr w:type="spellStart"/>
       <w:r>
         <w:rPr>
-          <w:lang w:val="en-US"/>
+          <w:rFonts w:ascii="Calibri" w:hAnsi="Calibri" w:cs="Calibri"/>
         </w:rPr>
         <w:t>Billingshurst</w:t>
       </w:r>
       <w:proofErr w:type="spellEnd"/>
       <w:r>
         <w:rPr>
-          <w:lang w:val="en-US"/>
-        </w:rPr>
-        <w:t xml:space="preserve"> signal box is celebrating its 150</w:t>
-      </w:r>
-      <w:r>
-        <w:rPr>
+          <w:rFonts w:ascii="Calibri" w:hAnsi="Calibri" w:cs="Calibri"/>
+        </w:rPr>
+        <w:t xml:space="preserve"> signal box, which is celebrating its 150</w:t>
+      </w:r>
+      <w:r>
+        <w:rPr>
+          <w:rFonts w:ascii="Calibri" w:hAnsi="Calibri" w:cs="Calibri"/>
           <w:vertAlign w:val="superscript"/>
-          <w:lang w:val="en-US"/>
         </w:rPr>
         <w:t>th</w:t>
       </w:r>
       <w:r>
         <w:rPr>
-          <w:lang w:val="en-US"/>
-        </w:rPr>
-        <w:t xml:space="preserve"> anniversary this year.  It was installed at the museum following its </w:t>
-      </w:r>
-      <w:bookmarkStart w:id="0" w:name="_GoBack"/>
-      <w:bookmarkEnd w:id="0"/>
-      <w:r>
-        <w:rPr>
-          <w:lang w:val="en-US"/>
-        </w:rPr>
-        <w:t xml:space="preserve">removal from </w:t>
-      </w:r>
-      <w:proofErr w:type="spellStart"/>
-      <w:r>
-        <w:rPr>
-          <w:lang w:val="en-US"/>
-        </w:rPr>
-        <w:t>Billingshurst</w:t>
-      </w:r>
-      <w:proofErr w:type="spellEnd"/>
-      <w:r>
-        <w:rPr>
-          <w:lang w:val="en-US"/>
-        </w:rPr>
-        <w:t xml:space="preserve"> stat</w:t>
-      </w:r>
-      <w:r>
-        <w:rPr>
-          <w:lang w:val="en-US"/>
-        </w:rPr>
-        <w:t xml:space="preserve">ion </w:t>
-      </w:r>
-      <w:r>
-        <w:rPr>
-          <w:lang w:val="en-US"/>
-        </w:rPr>
-        <w:t>about 10 years ago</w:t>
-      </w:r>
-      <w:r>
-        <w:rPr>
-          <w:lang w:val="en-US"/>
-        </w:rPr>
-        <w:t>, and is now being opened more frequently due</w:t>
-      </w:r>
-      <w:r>
-        <w:rPr>
-          <w:lang w:val="en-US"/>
-        </w:rPr>
-        <w:t xml:space="preserve"> to the recruitment of new</w:t>
-      </w:r>
-      <w:r>
-        <w:rPr>
-          <w:lang w:val="en-US"/>
-        </w:rPr>
-        <w:t xml:space="preserve"> volunteers.  Presently it is open on Wednesdays and Saturdays, plus </w:t>
-      </w:r>
-      <w:r>
-        <w:rPr>
           <w:rFonts w:ascii="Calibri" w:hAnsi="Calibri" w:cs="Calibri"/>
-          <w:lang w:val="en-US"/>
-        </w:rPr>
-        <w:t>additional</w:t>
-      </w:r>
-      <w:r>
-        <w:rPr>
-          <w:lang w:val="en-US"/>
-        </w:rPr>
-        <w:t xml:space="preserve"> weekend opening when there are special events.</w:t>
-      </w:r>
-      <w:r>
-        <w:rPr>
-          <w:lang w:val="en-US"/>
-        </w:rPr>
-        <w:t xml:space="preserve">  The box is kept locked when there is no volunteer in attendance.</w:t>
+        </w:rPr>
+        <w:t xml:space="preserve"> anniversary this year, was installed at the museum about 10 years ago.</w:t>
+      </w:r>
+      <w:proofErr w:type="gramEnd"/>
+      <w:r>
+        <w:rPr>
+          <w:rFonts w:ascii="Calibri" w:hAnsi="Calibri" w:cs="Calibri"/>
+        </w:rPr>
+        <w:t xml:space="preserve">  Rather than</w:t>
+      </w:r>
+      <w:r>
+        <w:rPr>
+          <w:rFonts w:ascii="Calibri" w:hAnsi="Calibri" w:cs="Calibri"/>
+        </w:rPr>
+        <w:t xml:space="preserve"> the box</w:t>
+      </w:r>
+      <w:r>
+        <w:rPr>
+          <w:rFonts w:ascii="Calibri" w:hAnsi="Calibri" w:cs="Calibri"/>
+        </w:rPr>
+        <w:t xml:space="preserve"> being a static exhibit the emphasis has been on having a volunteer demonstrate the process of running trains, which was by passing them along a route from signal box to signal box, and setting signals for the drivers accordingly.</w:t>
       </w:r>
     </w:p>
     <w:p>
       <w:pPr>
-        <w:rPr>
-          <w:lang w:val="en-US"/>
-        </w:rPr>
-      </w:pPr>
-      <w:r>
-        <w:rPr>
-          <w:lang w:val="en-US"/>
-        </w:rPr>
-        <w:t>The box is used to demonstrate the p</w:t>
-      </w:r>
-      <w:r>
-        <w:rPr>
-          <w:lang w:val="en-US"/>
-        </w:rPr>
-        <w:t>rocedure o</w:t>
-      </w:r>
-      <w:r>
-        <w:rPr>
-          <w:lang w:val="en-US"/>
-        </w:rPr>
-        <w:t>f running</w:t>
-      </w:r>
-      <w:r>
-        <w:rPr>
-          <w:lang w:val="en-US"/>
-        </w:rPr>
-        <w:t xml:space="preserve"> trains by passing them along a route from signal box to signal box, and setting signals for the drivers accordingly.  </w:t>
-      </w:r>
-      <w:r>
-        <w:rPr>
-          <w:lang w:val="en-US"/>
-        </w:rPr>
-        <w:t>We obviously lack</w:t>
-      </w:r>
-      <w:r>
-        <w:rPr>
-          <w:lang w:val="en-US"/>
-        </w:rPr>
-        <w:t xml:space="preserve"> trains, signals and adjacent signal boxes to achieve this </w:t>
-      </w:r>
-      <w:r>
-        <w:rPr>
-          <w:lang w:val="en-US"/>
-        </w:rPr>
-        <w:t xml:space="preserve">in reality </w:t>
-      </w:r>
-      <w:r>
-        <w:rPr>
-          <w:lang w:val="en-US"/>
-        </w:rPr>
-        <w:t>although some progress has been made with the construction of a microprocessor simulator to</w:t>
-      </w:r>
-      <w:r>
-        <w:rPr>
-          <w:lang w:val="en-US"/>
-        </w:rPr>
-        <w:t xml:space="preserve"> mimic the movement of trains by</w:t>
-      </w:r>
-      <w:r>
-        <w:rPr>
-          <w:lang w:val="en-US"/>
-        </w:rPr>
-        <w:t xml:space="preserve"> control</w:t>
-      </w:r>
-      <w:r>
-        <w:rPr>
-          <w:lang w:val="en-US"/>
-        </w:rPr>
-        <w:t>ling</w:t>
-      </w:r>
-      <w:r>
-        <w:rPr>
-          <w:lang w:val="en-US"/>
-        </w:rPr>
-        <w:t xml:space="preserve"> the lamps on</w:t>
-      </w:r>
-      <w:r>
-        <w:rPr>
-          <w:lang w:val="en-US"/>
-        </w:rPr>
-        <w:t xml:space="preserve"> the signal box </w:t>
-      </w:r>
-      <w:r>
-        <w:rPr>
-          <w:lang w:val="en-US"/>
-        </w:rPr>
-        <w:t>tr</w:t>
-      </w:r>
-      <w:r>
-        <w:rPr>
-          <w:lang w:val="en-US"/>
-        </w:rPr>
-        <w:t>ack circuit diagram,</w:t>
-      </w:r>
-      <w:r>
-        <w:rPr>
-          <w:lang w:val="en-US"/>
-        </w:rPr>
-        <w:t xml:space="preserve"> and to simulate the bell code communications with </w:t>
-      </w:r>
-      <w:r>
-        <w:rPr>
-          <w:lang w:val="en-US"/>
-        </w:rPr>
-        <w:t xml:space="preserve">an imaginary </w:t>
-      </w:r>
-      <w:r>
-        <w:rPr>
-          <w:lang w:val="en-US"/>
-        </w:rPr>
-        <w:t>signaler</w:t>
-      </w:r>
-      <w:r>
-        <w:rPr>
-          <w:lang w:val="en-US"/>
-        </w:rPr>
-        <w:t xml:space="preserve"> in an adjacent signal box.</w:t>
-      </w:r>
-      <w:r>
-        <w:rPr>
-          <w:lang w:val="en-US"/>
-        </w:rPr>
-        <w:t xml:space="preserve">  </w:t>
+        <w:autoSpaceDE w:val="0"/>
+        <w:autoSpaceDN w:val="0"/>
+        <w:adjustRightInd w:val="0"/>
+        <w:rPr>
+          <w:rFonts w:ascii="Calibri" w:hAnsi="Calibri" w:cs="Calibri"/>
+        </w:rPr>
+      </w:pPr>
+      <w:r>
+        <w:rPr>
+          <w:rFonts w:ascii="Calibri" w:hAnsi="Calibri" w:cs="Calibri"/>
+        </w:rPr>
+        <w:t>For demonstration purposes we obviously lack trains, signals and neighbouring signal boxes.  However a recent improvement has been the addition of a microprocessor simulator to mimic the movement of trains by controlling the lamps on the track circuit diagram that, along with the lever frame, forms the centre-piece of the signal box, and to simulate the bell code communications with an imaginary signaller in the next signal box along the line.</w:t>
       </w:r>
     </w:p>
     <w:p>
@@ -405,7 +256,13 @@
         <w:rPr>
           <w:lang w:val="en-US"/>
         </w:rPr>
-        <w:t xml:space="preserve"> type h</w:t>
+        <w:t xml:space="preserve"> variety</w:t>
+      </w:r>
+      <w:r>
+        <w:rPr>
+          <w:lang w:val="en-US"/>
+        </w:rPr>
+        <w:t xml:space="preserve"> h</w:t>
       </w:r>
       <w:r>
         <w:rPr>
@@ -464,15 +321,15 @@
         <mc:AlternateContent>
           <mc:Choice Requires="wps">
             <w:drawing>
-              <wp:anchor distT="0" distB="0" distL="114300" distR="114300" simplePos="0" relativeHeight="251662336" behindDoc="0" locked="0" layoutInCell="1" allowOverlap="1" wp14:anchorId="5FAC61FF" wp14:editId="73384A7A">
+              <wp:anchor distT="0" distB="0" distL="114300" distR="114300" simplePos="0" relativeHeight="251662336" behindDoc="0" locked="0" layoutInCell="1" allowOverlap="1" wp14:anchorId="71F6EA18" wp14:editId="287F7C5A">
                 <wp:simplePos x="0" y="0"/>
                 <wp:positionH relativeFrom="column">
-                  <wp:posOffset>357505</wp:posOffset>
+                  <wp:posOffset>400050</wp:posOffset>
                 </wp:positionH>
                 <wp:positionV relativeFrom="paragraph">
-                  <wp:posOffset>2951480</wp:posOffset>
+                  <wp:posOffset>3625850</wp:posOffset>
                 </wp:positionV>
-                <wp:extent cx="2181225" cy="733425"/>
+                <wp:extent cx="2181225" cy="447675"/>
                 <wp:effectExtent l="0" t="0" r="28575" b="28575"/>
                 <wp:wrapNone/>
                 <wp:docPr id="3" name="Text Box 2"/>
@@ -488,7 +345,7 @@
                       <wps:spPr bwMode="auto">
                         <a:xfrm>
                           <a:off x="0" y="0"/>
-                          <a:ext cx="2181225" cy="733425"/>
+                          <a:ext cx="2181225" cy="447675"/>
                         </a:xfrm>
                         <a:prstGeom prst="rect">
                           <a:avLst/>
@@ -533,7 +390,7 @@
                                 <w:szCs w:val="20"/>
                                 <w:lang w:val="en-US"/>
                               </w:rPr>
-                              <w:t>imilar s</w:t>
+                              <w:t>ignal as</w:t>
                             </w:r>
                             <w:r>
                               <w:rPr>
@@ -542,36 +399,7 @@
                                 <w:szCs w:val="20"/>
                                 <w:lang w:val="en-US"/>
                               </w:rPr>
-                              <w:t xml:space="preserve">ignal </w:t>
-                            </w:r>
-                            <w:r>
-                              <w:rPr>
-                                <w:i/>
-                                <w:sz w:val="20"/>
-                                <w:szCs w:val="20"/>
-                                <w:lang w:val="en-US"/>
-                              </w:rPr>
-                              <w:t xml:space="preserve">removed from the </w:t>
-                            </w:r>
-                            <w:proofErr w:type="spellStart"/>
-                            <w:r>
-                              <w:rPr>
-                                <w:i/>
-                                <w:sz w:val="20"/>
-                                <w:szCs w:val="20"/>
-                                <w:lang w:val="en-US"/>
-                              </w:rPr>
-                              <w:t>Arun</w:t>
-                            </w:r>
-                            <w:proofErr w:type="spellEnd"/>
-                            <w:r>
-                              <w:rPr>
-                                <w:i/>
-                                <w:sz w:val="20"/>
-                                <w:szCs w:val="20"/>
-                                <w:lang w:val="en-US"/>
-                              </w:rPr>
-                              <w:t xml:space="preserve"> Valley line and </w:t>
+                              <w:t xml:space="preserve"> </w:t>
                             </w:r>
                             <w:r>
                               <w:rPr>
@@ -606,7 +434,7 @@
                 <v:stroke joinstyle="miter"/>
                 <v:path gradientshapeok="t" o:connecttype="rect"/>
               </v:shapetype>
-              <v:shape id="Text Box 2" o:spid="_x0000_s1026" type="#_x0000_t202" style="position:absolute;margin-left:28.15pt;margin-top:232.4pt;width:171.75pt;height:57.75pt;z-index:251662336;visibility:visible;mso-wrap-style:square;mso-width-percent:0;mso-height-percent:0;mso-wrap-distance-left:9pt;mso-wrap-distance-top:0;mso-wrap-distance-right:9pt;mso-wrap-distance-bottom:0;mso-position-horizontal:absolute;mso-position-horizontal-relative:text;mso-position-vertical:absolute;mso-position-vertical-relative:text;mso-width-percent:0;mso-height-percent:0;mso-width-relative:margin;mso-height-relative:margin;v-text-anchor:top" o:gfxdata="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">
+              <v:shape id="Text Box 2" o:spid="_x0000_s1026" type="#_x0000_t202" style="position:absolute;margin-left:31.5pt;margin-top:285.5pt;width:171.75pt;height:35.25pt;z-index:251662336;visibility:visible;mso-wrap-style:square;mso-width-percent:0;mso-height-percent:0;mso-wrap-distance-left:9pt;mso-wrap-distance-top:0;mso-wrap-distance-right:9pt;mso-wrap-distance-bottom:0;mso-position-horizontal:absolute;mso-position-horizontal-relative:text;mso-position-vertical:absolute;mso-position-vertical-relative:text;mso-width-percent:0;mso-height-percent:0;mso-width-relative:margin;mso-height-relative:margin;v-text-anchor:top" o:gfxdata="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">
                 <v:textbox>
                   <w:txbxContent>
                     <w:p>
@@ -635,7 +463,7 @@
                           <w:szCs w:val="20"/>
                           <w:lang w:val="en-US"/>
                         </w:rPr>
-                        <w:t>imilar s</w:t>
+                        <w:t>ignal as</w:t>
                       </w:r>
                       <w:r>
                         <w:rPr>
@@ -644,36 +472,7 @@
                           <w:szCs w:val="20"/>
                           <w:lang w:val="en-US"/>
                         </w:rPr>
-                        <w:t xml:space="preserve">ignal </w:t>
-                      </w:r>
-                      <w:r>
-                        <w:rPr>
-                          <w:i/>
-                          <w:sz w:val="20"/>
-                          <w:szCs w:val="20"/>
-                          <w:lang w:val="en-US"/>
-                        </w:rPr>
-                        <w:t xml:space="preserve">removed from the </w:t>
-                      </w:r>
-                      <w:proofErr w:type="spellStart"/>
-                      <w:r>
-                        <w:rPr>
-                          <w:i/>
-                          <w:sz w:val="20"/>
-                          <w:szCs w:val="20"/>
-                          <w:lang w:val="en-US"/>
-                        </w:rPr>
-                        <w:t>Arun</w:t>
-                      </w:r>
-                      <w:proofErr w:type="spellEnd"/>
-                      <w:r>
-                        <w:rPr>
-                          <w:i/>
-                          <w:sz w:val="20"/>
-                          <w:szCs w:val="20"/>
-                          <w:lang w:val="en-US"/>
-                        </w:rPr>
-                        <w:t xml:space="preserve"> Valley line and </w:t>
+                        <w:t xml:space="preserve"> </w:t>
                       </w:r>
                       <w:r>
                         <w:rPr>
@@ -700,15 +499,15 @@
         <mc:AlternateContent>
           <mc:Choice Requires="wps">
             <w:drawing>
-              <wp:anchor distT="0" distB="0" distL="114300" distR="114300" simplePos="0" relativeHeight="251660288" behindDoc="0" locked="0" layoutInCell="1" allowOverlap="1" wp14:anchorId="4D583F74" wp14:editId="4D8715C4">
+              <wp:anchor distT="0" distB="0" distL="114300" distR="114300" simplePos="0" relativeHeight="251660288" behindDoc="0" locked="0" layoutInCell="1" allowOverlap="1" wp14:anchorId="2695CE17" wp14:editId="5C10220B">
                 <wp:simplePos x="0" y="0"/>
                 <wp:positionH relativeFrom="column">
-                  <wp:posOffset>-2499995</wp:posOffset>
+                  <wp:posOffset>-2514600</wp:posOffset>
                 </wp:positionH>
                 <wp:positionV relativeFrom="paragraph">
-                  <wp:posOffset>2951480</wp:posOffset>
+                  <wp:posOffset>3624580</wp:posOffset>
                 </wp:positionV>
-                <wp:extent cx="2028825" cy="733425"/>
+                <wp:extent cx="2028825" cy="447675"/>
                 <wp:effectExtent l="0" t="0" r="28575" b="28575"/>
                 <wp:wrapNone/>
                 <wp:docPr id="307" name="Text Box 2"/>
@@ -724,7 +523,7 @@
                       <wps:spPr bwMode="auto">
                         <a:xfrm>
                           <a:off x="0" y="0"/>
-                          <a:ext cx="2028825" cy="733425"/>
+                          <a:ext cx="2028825" cy="447675"/>
                         </a:xfrm>
                         <a:prstGeom prst="rect">
                           <a:avLst/>
@@ -758,7 +557,7 @@
                                 <w:sz w:val="20"/>
                                 <w:szCs w:val="20"/>
                               </w:rPr>
-                              <w:t xml:space="preserve">Example of a Southern Railway semaphore signal at </w:t>
+                              <w:t xml:space="preserve">Southern Railway semaphore signal at </w:t>
                             </w:r>
                             <w:proofErr w:type="spellStart"/>
                             <w:r>
@@ -767,7 +566,15 @@
                                 <w:sz w:val="20"/>
                                 <w:szCs w:val="20"/>
                               </w:rPr>
-                              <w:t>Amberley</w:t>
+                              <w:t>A</w:t>
+                            </w:r>
+                            <w:r>
+                              <w:rPr>
+                                <w:i/>
+                                <w:sz w:val="20"/>
+                                <w:szCs w:val="20"/>
+                              </w:rPr>
+                              <w:t>mberley</w:t>
                             </w:r>
                             <w:proofErr w:type="spellEnd"/>
                             <w:r>
@@ -776,7 +583,7 @@
                                 <w:sz w:val="20"/>
                                 <w:szCs w:val="20"/>
                               </w:rPr>
-                              <w:t xml:space="preserve"> station prior to removal</w:t>
+                              <w:t xml:space="preserve"> station</w:t>
                             </w:r>
                           </w:p>
                         </w:txbxContent>
@@ -798,7 +605,7 @@
           </mc:Choice>
           <mc:Fallback>
             <w:pict>
-              <v:shape id="_x0000_s1027" type="#_x0000_t202" style="position:absolute;margin-left:-196.85pt;margin-top:232.4pt;width:159.75pt;height:57.75pt;z-index:251660288;visibility:visible;mso-wrap-style:square;mso-width-percent:0;mso-height-percent:0;mso-wrap-distance-left:9pt;mso-wrap-distance-top:0;mso-wrap-distance-right:9pt;mso-wrap-distance-bottom:0;mso-position-horizontal:absolute;mso-position-horizontal-relative:text;mso-position-vertical:absolute;mso-position-vertical-relative:text;mso-width-percent:0;mso-height-percent:0;mso-width-relative:margin;mso-height-relative:margin;v-text-anchor:top" o:gfxdata="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">
+              <v:shape id="_x0000_s1027" type="#_x0000_t202" style="position:absolute;margin-left:-198pt;margin-top:285.4pt;width:159.75pt;height:35.25pt;z-index:251660288;visibility:visible;mso-wrap-style:square;mso-width-percent:0;mso-height-percent:0;mso-wrap-distance-left:9pt;mso-wrap-distance-top:0;mso-wrap-distance-right:9pt;mso-wrap-distance-bottom:0;mso-position-horizontal:absolute;mso-position-horizontal-relative:text;mso-position-vertical:absolute;mso-position-vertical-relative:text;mso-width-percent:0;mso-height-percent:0;mso-width-relative:margin;mso-height-relative:margin;v-text-anchor:top" o:gfxdata="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">
                 <v:textbox>
                   <w:txbxContent>
                     <w:p>
@@ -816,7 +623,7 @@
                           <w:sz w:val="20"/>
                           <w:szCs w:val="20"/>
                         </w:rPr>
-                        <w:t xml:space="preserve">Example of a Southern Railway semaphore signal at </w:t>
+                        <w:t xml:space="preserve">Southern Railway semaphore signal at </w:t>
                       </w:r>
                       <w:proofErr w:type="spellStart"/>
                       <w:r>
@@ -825,7 +632,15 @@
                           <w:sz w:val="20"/>
                           <w:szCs w:val="20"/>
                         </w:rPr>
-                        <w:t>Amberley</w:t>
+                        <w:t>A</w:t>
+                      </w:r>
+                      <w:r>
+                        <w:rPr>
+                          <w:i/>
+                          <w:sz w:val="20"/>
+                          <w:szCs w:val="20"/>
+                        </w:rPr>
+                        <w:t>mberley</w:t>
                       </w:r>
                       <w:proofErr w:type="spellEnd"/>
                       <w:r>
@@ -834,7 +649,7 @@
                           <w:sz w:val="20"/>
                           <w:szCs w:val="20"/>
                         </w:rPr>
-                        <w:t xml:space="preserve"> station prior to removal</w:t>
+                        <w:t xml:space="preserve"> station</w:t>
                       </w:r>
                     </w:p>
                   </w:txbxContent>
@@ -850,18 +665,26 @@
           <w:lang w:eastAsia="en-GB"/>
         </w:rPr>
         <w:drawing>
-          <wp:anchor distT="0" distB="0" distL="114300" distR="114300" simplePos="0" relativeHeight="251658240" behindDoc="0" locked="0" layoutInCell="1" allowOverlap="1" wp14:anchorId="525ADBC4" wp14:editId="02ADC6B3">
+          <wp:anchor distT="0" distB="0" distL="114300" distR="114300" simplePos="0" relativeHeight="251663360" behindDoc="1" locked="0" layoutInCell="1" allowOverlap="1" wp14:anchorId="19C33966" wp14:editId="717DBEF1">
             <wp:simplePos x="0" y="0"/>
             <wp:positionH relativeFrom="column">
-              <wp:posOffset>46990</wp:posOffset>
+              <wp:posOffset>3149600</wp:posOffset>
             </wp:positionH>
             <wp:positionV relativeFrom="paragraph">
-              <wp:posOffset>18415</wp:posOffset>
+              <wp:posOffset>97790</wp:posOffset>
             </wp:positionV>
-            <wp:extent cx="2806700" cy="3743325"/>
-            <wp:effectExtent l="0" t="0" r="0" b="9525"/>
-            <wp:wrapSquare wrapText="bothSides"/>
-            <wp:docPr id="1" name="Picture 1"/>
+            <wp:extent cx="2591435" cy="3455670"/>
+            <wp:effectExtent l="0" t="0" r="0" b="0"/>
+            <wp:wrapTight wrapText="bothSides">
+              <wp:wrapPolygon edited="0">
+                <wp:start x="0" y="0"/>
+                <wp:lineTo x="0" y="21433"/>
+                <wp:lineTo x="21436" y="21433"/>
+                <wp:lineTo x="21436" y="0"/>
+                <wp:lineTo x="0" y="0"/>
+              </wp:wrapPolygon>
+            </wp:wrapTight>
+            <wp:docPr id="4" name="Picture 4"/>
             <wp:cNvGraphicFramePr>
               <a:graphicFrameLocks xmlns:a="http://schemas.openxmlformats.org/drawingml/2006/main" noChangeAspect="1"/>
             </wp:cNvGraphicFramePr>
@@ -869,7 +692,7 @@
               <a:graphicData uri="http://schemas.openxmlformats.org/drawingml/2006/picture">
                 <pic:pic xmlns:pic="http://schemas.openxmlformats.org/drawingml/2006/picture">
                   <pic:nvPicPr>
-                    <pic:cNvPr id="0" name="8074782109_94410f3dd5_b.jpg"/>
+                    <pic:cNvPr id="0" name="Complete.jpg"/>
                     <pic:cNvPicPr/>
                   </pic:nvPicPr>
                   <pic:blipFill>
@@ -887,7 +710,7 @@
                   <pic:spPr>
                     <a:xfrm>
                       <a:off x="0" y="0"/>
-                      <a:ext cx="2806700" cy="3743325"/>
+                      <a:ext cx="2591435" cy="3455670"/>
                     </a:xfrm>
                     <a:prstGeom prst="rect">
                       <a:avLst/>
@@ -911,10 +734,26 @@
           <w:lang w:eastAsia="en-GB"/>
         </w:rPr>
         <w:drawing>
-          <wp:inline distT="0" distB="0" distL="0" distR="0" wp14:anchorId="1087050F" wp14:editId="26D9D29D">
-            <wp:extent cx="2819400" cy="3759305"/>
-            <wp:effectExtent l="0" t="0" r="0" b="0"/>
-            <wp:docPr id="4" name="Picture 4"/>
+          <wp:anchor distT="0" distB="0" distL="114300" distR="114300" simplePos="0" relativeHeight="251664384" behindDoc="1" locked="0" layoutInCell="1" allowOverlap="1" wp14:anchorId="34C478C2" wp14:editId="70598D74">
+            <wp:simplePos x="0" y="0"/>
+            <wp:positionH relativeFrom="column">
+              <wp:posOffset>0</wp:posOffset>
+            </wp:positionH>
+            <wp:positionV relativeFrom="paragraph">
+              <wp:posOffset>103505</wp:posOffset>
+            </wp:positionV>
+            <wp:extent cx="2811145" cy="3455670"/>
+            <wp:effectExtent l="0" t="0" r="8255" b="0"/>
+            <wp:wrapTight wrapText="bothSides">
+              <wp:wrapPolygon edited="0">
+                <wp:start x="0" y="0"/>
+                <wp:lineTo x="0" y="21433"/>
+                <wp:lineTo x="21517" y="21433"/>
+                <wp:lineTo x="21517" y="0"/>
+                <wp:lineTo x="0" y="0"/>
+              </wp:wrapPolygon>
+            </wp:wrapTight>
+            <wp:docPr id="2" name="Picture 2"/>
             <wp:cNvGraphicFramePr>
               <a:graphicFrameLocks xmlns:a="http://schemas.openxmlformats.org/drawingml/2006/main" noChangeAspect="1"/>
             </wp:cNvGraphicFramePr>
@@ -922,7 +761,7 @@
               <a:graphicData uri="http://schemas.openxmlformats.org/drawingml/2006/picture">
                 <pic:pic xmlns:pic="http://schemas.openxmlformats.org/drawingml/2006/picture">
                   <pic:nvPicPr>
-                    <pic:cNvPr id="0" name="Complete.jpg"/>
+                    <pic:cNvPr id="0" name="waiting-for-the-train-at-amberley-D2R3JN.jpg"/>
                     <pic:cNvPicPr/>
                   </pic:nvPicPr>
                   <pic:blipFill>
@@ -940,7 +779,7 @@
                   <pic:spPr>
                     <a:xfrm>
                       <a:off x="0" y="0"/>
-                      <a:ext cx="2825205" cy="3767046"/>
+                      <a:ext cx="2811145" cy="3455670"/>
                     </a:xfrm>
                     <a:prstGeom prst="rect">
                       <a:avLst/>
@@ -949,14 +788,19 @@
                 </pic:pic>
               </a:graphicData>
             </a:graphic>
-          </wp:inline>
+            <wp14:sizeRelH relativeFrom="margin">
+              <wp14:pctWidth>0</wp14:pctWidth>
+            </wp14:sizeRelH>
+            <wp14:sizeRelV relativeFrom="margin">
+              <wp14:pctHeight>0</wp14:pctHeight>
+            </wp14:sizeRelV>
+          </wp:anchor>
         </w:drawing>
       </w:r>
       <w:r>
         <w:rPr>
           <w:lang w:val="en-US"/>
         </w:rPr>
-        <w:lastRenderedPageBreak/>
         <w:br w:type="textWrapping" w:clear="all"/>
       </w:r>
     </w:p>
@@ -972,6 +816,487 @@
         </w:rPr>
         <w:br w:type="page"/>
       </w:r>
+    </w:p>
+    <w:p>
+      <w:pPr>
+        <w:pStyle w:val="Heading5"/>
+        <w:numPr>
+          <w:ilvl w:val="0"/>
+          <w:numId w:val="2"/>
+        </w:numPr>
+        <w:rPr>
+          <w:b/>
+          <w:lang w:val="en-US"/>
+        </w:rPr>
+      </w:pPr>
+      <w:r>
+        <w:rPr>
+          <w:b/>
+          <w:lang w:val="en-US"/>
+        </w:rPr>
+        <w:lastRenderedPageBreak/>
+        <w:t>Required Works</w:t>
+      </w:r>
+    </w:p>
+    <w:p>
+      <w:pPr>
+        <w:rPr>
+          <w:lang w:val="en-US"/>
+        </w:rPr>
+      </w:pPr>
+    </w:p>
+    <w:p>
+      <w:pPr>
+        <w:rPr>
+          <w:lang w:val="en-US"/>
+        </w:rPr>
+      </w:pPr>
+      <w:r>
+        <w:rPr>
+          <w:lang w:val="en-US"/>
+        </w:rPr>
+        <w:t>The main tasks are as follows:</w:t>
+      </w:r>
+    </w:p>
+    <w:p>
+      <w:pPr>
+        <w:pStyle w:val="ListParagraph"/>
+        <w:numPr>
+          <w:ilvl w:val="0"/>
+          <w:numId w:val="4"/>
+        </w:numPr>
+        <w:rPr>
+          <w:lang w:val="en-US"/>
+        </w:rPr>
+      </w:pPr>
+      <w:r>
+        <w:rPr>
+          <w:lang w:val="en-US"/>
+        </w:rPr>
+        <w:t>Refurbishment of the signal arm, this includes:</w:t>
+      </w:r>
+    </w:p>
+    <w:p>
+      <w:pPr>
+        <w:pStyle w:val="ListParagraph"/>
+        <w:ind w:left="360"/>
+        <w:rPr>
+          <w:lang w:val="en-US"/>
+        </w:rPr>
+      </w:pPr>
+      <w:r>
+        <w:rPr>
+          <w:lang w:val="en-US"/>
+        </w:rPr>
+        <w:t>Preparation of surfaces and applying coatings</w:t>
+      </w:r>
+    </w:p>
+    <w:p>
+      <w:pPr>
+        <w:pStyle w:val="ListParagraph"/>
+        <w:ind w:left="360"/>
+        <w:rPr>
+          <w:lang w:val="en-US"/>
+        </w:rPr>
+      </w:pPr>
+      <w:r>
+        <w:rPr>
+          <w:lang w:val="en-US"/>
+        </w:rPr>
+        <w:t>Fitting of any parts that would be difficult once the signal is erected</w:t>
+      </w:r>
+    </w:p>
+    <w:p>
+      <w:pPr>
+        <w:pStyle w:val="ListParagraph"/>
+        <w:numPr>
+          <w:ilvl w:val="0"/>
+          <w:numId w:val="4"/>
+        </w:numPr>
+        <w:rPr>
+          <w:lang w:val="en-US"/>
+        </w:rPr>
+      </w:pPr>
+      <w:r>
+        <w:rPr>
+          <w:lang w:val="en-US"/>
+        </w:rPr>
+        <w:t>Preparation of the signal site:</w:t>
+      </w:r>
+    </w:p>
+    <w:p>
+      <w:pPr>
+        <w:pStyle w:val="ListParagraph"/>
+        <w:ind w:left="360"/>
+        <w:rPr>
+          <w:lang w:val="en-US"/>
+        </w:rPr>
+      </w:pPr>
+      <w:r>
+        <w:rPr>
+          <w:lang w:val="en-US"/>
+        </w:rPr>
+        <w:t>Excavation, either by hand or using an auger</w:t>
+      </w:r>
+      <w:r>
+        <w:rPr>
+          <w:lang w:val="en-US"/>
+        </w:rPr>
+        <w:t>, to a depth of 0.9-1.2m</w:t>
+      </w:r>
+    </w:p>
+    <w:p>
+      <w:pPr>
+        <w:pStyle w:val="ListParagraph"/>
+        <w:ind w:left="360"/>
+        <w:rPr>
+          <w:lang w:val="en-US"/>
+        </w:rPr>
+      </w:pPr>
+      <w:r>
+        <w:rPr>
+          <w:lang w:val="en-US"/>
+        </w:rPr>
+        <w:t>Formation of a concrete base</w:t>
+      </w:r>
+      <w:r>
+        <w:rPr>
+          <w:lang w:val="en-US"/>
+        </w:rPr>
+        <w:t xml:space="preserve"> with a 30Mpa mix</w:t>
+      </w:r>
+    </w:p>
+    <w:p>
+      <w:pPr>
+        <w:pStyle w:val="ListParagraph"/>
+        <w:numPr>
+          <w:ilvl w:val="0"/>
+          <w:numId w:val="4"/>
+        </w:numPr>
+        <w:rPr>
+          <w:lang w:val="en-US"/>
+        </w:rPr>
+      </w:pPr>
+      <w:r>
+        <w:rPr>
+          <w:lang w:val="en-US"/>
+        </w:rPr>
+        <w:t>Moving the signal to site and installing it:</w:t>
+      </w:r>
+    </w:p>
+    <w:p>
+      <w:pPr>
+        <w:pStyle w:val="ListParagraph"/>
+        <w:ind w:left="360"/>
+        <w:rPr>
+          <w:lang w:val="en-US"/>
+        </w:rPr>
+      </w:pPr>
+      <w:r>
+        <w:rPr>
+          <w:lang w:val="en-US"/>
+        </w:rPr>
+        <w:t xml:space="preserve">Using a </w:t>
+      </w:r>
+      <w:proofErr w:type="spellStart"/>
+      <w:r>
+        <w:rPr>
+          <w:lang w:val="en-US"/>
+        </w:rPr>
+        <w:t>flat bed</w:t>
+      </w:r>
+      <w:proofErr w:type="spellEnd"/>
+      <w:r>
+        <w:rPr>
+          <w:lang w:val="en-US"/>
+        </w:rPr>
+        <w:t xml:space="preserve"> lorry with a HIAB crane</w:t>
+      </w:r>
+    </w:p>
+    <w:p>
+      <w:pPr>
+        <w:pStyle w:val="ListParagraph"/>
+        <w:numPr>
+          <w:ilvl w:val="0"/>
+          <w:numId w:val="4"/>
+        </w:numPr>
+        <w:rPr>
+          <w:lang w:val="en-US"/>
+        </w:rPr>
+      </w:pPr>
+      <w:r>
+        <w:rPr>
+          <w:lang w:val="en-US"/>
+        </w:rPr>
+        <w:t>Connecting the signal to the signal box:</w:t>
+      </w:r>
+    </w:p>
+    <w:p>
+      <w:pPr>
+        <w:pStyle w:val="ListParagraph"/>
+        <w:ind w:left="360"/>
+        <w:rPr>
+          <w:lang w:val="en-US"/>
+        </w:rPr>
+      </w:pPr>
+      <w:r>
+        <w:rPr>
+          <w:lang w:val="en-US"/>
+        </w:rPr>
+        <w:t>Either a mechanical link from a signal box lever, or an electrical actuation system</w:t>
+      </w:r>
+    </w:p>
+    <w:p>
+      <w:pPr>
+        <w:pStyle w:val="ListParagraph"/>
+        <w:ind w:left="360"/>
+        <w:rPr>
+          <w:lang w:val="en-US"/>
+        </w:rPr>
+      </w:pPr>
+    </w:p>
+    <w:p>
+      <w:pPr>
+        <w:pStyle w:val="Heading5"/>
+        <w:numPr>
+          <w:ilvl w:val="0"/>
+          <w:numId w:val="2"/>
+        </w:numPr>
+        <w:rPr>
+          <w:b/>
+          <w:lang w:val="en-US"/>
+        </w:rPr>
+      </w:pPr>
+      <w:r>
+        <w:rPr>
+          <w:b/>
+          <w:lang w:val="en-US"/>
+        </w:rPr>
+        <w:t>Costs</w:t>
+      </w:r>
+    </w:p>
+    <w:p>
+      <w:pPr>
+        <w:rPr>
+          <w:lang w:val="en-US"/>
+        </w:rPr>
+      </w:pPr>
+    </w:p>
+    <w:p>
+      <w:pPr>
+        <w:rPr>
+          <w:lang w:val="en-US"/>
+        </w:rPr>
+      </w:pPr>
+      <w:r>
+        <w:rPr>
+          <w:lang w:val="en-US"/>
+        </w:rPr>
+        <w:t>The refurb</w:t>
+      </w:r>
+      <w:r>
+        <w:rPr>
+          <w:lang w:val="en-US"/>
+        </w:rPr>
+        <w:t xml:space="preserve">ishment would be carried out using volunteer </w:t>
+      </w:r>
+      <w:proofErr w:type="spellStart"/>
+      <w:r>
+        <w:rPr>
+          <w:lang w:val="en-US"/>
+        </w:rPr>
+        <w:t>labour</w:t>
+      </w:r>
+      <w:proofErr w:type="spellEnd"/>
+      <w:r>
+        <w:rPr>
+          <w:lang w:val="en-US"/>
+        </w:rPr>
+        <w:t xml:space="preserve">, although some low cost preparation materials would </w:t>
+      </w:r>
+      <w:r>
+        <w:rPr>
+          <w:lang w:val="en-US"/>
+        </w:rPr>
+        <w:t>be requi</w:t>
+      </w:r>
+      <w:r>
+        <w:rPr>
+          <w:lang w:val="en-US"/>
+        </w:rPr>
+        <w:t>red.  The signal as delivered is missing the signal arm, a lamp, a counterweight and some minor fi</w:t>
+      </w:r>
+      <w:r>
+        <w:rPr>
+          <w:lang w:val="en-US"/>
+        </w:rPr>
+        <w:t>ttings, although we have already obtained a</w:t>
+      </w:r>
+      <w:r>
+        <w:rPr>
+          <w:lang w:val="en-US"/>
+        </w:rPr>
+        <w:t xml:space="preserve"> </w:t>
+      </w:r>
+      <w:r>
+        <w:rPr>
+          <w:lang w:val="en-US"/>
+        </w:rPr>
+        <w:t>donated</w:t>
+      </w:r>
+      <w:r>
+        <w:rPr>
+          <w:lang w:val="en-US"/>
+        </w:rPr>
+        <w:t xml:space="preserve"> replacement signal arm.  Structurally the signal looks sound.  </w:t>
+      </w:r>
+      <w:r>
+        <w:rPr>
+          <w:lang w:val="en-US"/>
+        </w:rPr>
+        <w:t>More significant</w:t>
+      </w:r>
+      <w:r>
+        <w:rPr>
+          <w:lang w:val="en-US"/>
+        </w:rPr>
+        <w:t xml:space="preserve"> would be </w:t>
+      </w:r>
+      <w:r>
+        <w:rPr>
+          <w:lang w:val="en-US"/>
+        </w:rPr>
+        <w:t xml:space="preserve">the cost of the paint </w:t>
+      </w:r>
+      <w:proofErr w:type="spellStart"/>
+      <w:r>
+        <w:rPr>
+          <w:lang w:val="en-US"/>
+        </w:rPr>
+        <w:t>eg</w:t>
+      </w:r>
+      <w:proofErr w:type="spellEnd"/>
+      <w:r>
+        <w:rPr>
+          <w:lang w:val="en-US"/>
+        </w:rPr>
+        <w:t xml:space="preserve"> a 2-pack epoxy (white and black).   </w:t>
+      </w:r>
+    </w:p>
+    <w:p>
+      <w:pPr>
+        <w:rPr>
+          <w:lang w:val="en-US"/>
+        </w:rPr>
+      </w:pPr>
+      <w:r>
+        <w:rPr>
+          <w:lang w:val="en-US"/>
+        </w:rPr>
+        <w:t xml:space="preserve">Likewise the operating mechanism can be installed with volunteer </w:t>
+      </w:r>
+      <w:proofErr w:type="spellStart"/>
+      <w:r>
+        <w:rPr>
+          <w:lang w:val="en-US"/>
+        </w:rPr>
+        <w:t>labour</w:t>
+      </w:r>
+      <w:proofErr w:type="spellEnd"/>
+      <w:r>
+        <w:rPr>
+          <w:lang w:val="en-US"/>
+        </w:rPr>
+        <w:t xml:space="preserve"> although some low to moderate cost items would be required.  A mechanical method (as-per the prototype), only requiring a length of galvanized wire and some small pulleys, would probably be chea</w:t>
+      </w:r>
+      <w:r>
+        <w:rPr>
+          <w:lang w:val="en-US"/>
+        </w:rPr>
+        <w:t xml:space="preserve">per than an electrical actuator, although would involve more volunteer </w:t>
+      </w:r>
+      <w:proofErr w:type="spellStart"/>
+      <w:r>
+        <w:rPr>
+          <w:lang w:val="en-US"/>
+        </w:rPr>
+        <w:t>labour</w:t>
+      </w:r>
+      <w:proofErr w:type="spellEnd"/>
+      <w:r>
+        <w:rPr>
+          <w:lang w:val="en-US"/>
+        </w:rPr>
+        <w:t>.</w:t>
+      </w:r>
+    </w:p>
+    <w:p>
+      <w:pPr>
+        <w:rPr>
+          <w:lang w:val="en-US"/>
+        </w:rPr>
+      </w:pPr>
+      <w:r>
+        <w:rPr>
+          <w:lang w:val="en-US"/>
+        </w:rPr>
+        <w:t>It should be noted that the cost of installing the signal in a working condition rather than as a static exhibit requires only a relatively small increase in overall cost and is therefore recommended.</w:t>
+      </w:r>
+    </w:p>
+    <w:p>
+      <w:pPr>
+        <w:rPr>
+          <w:lang w:val="en-US"/>
+        </w:rPr>
+      </w:pPr>
+      <w:r>
+        <w:rPr>
+          <w:lang w:val="en-US"/>
+        </w:rPr>
+        <w:t>Contractors would be required for the following</w:t>
+      </w:r>
+      <w:bookmarkStart w:id="0" w:name="_GoBack"/>
+      <w:bookmarkEnd w:id="0"/>
+      <w:r>
+        <w:rPr>
+          <w:lang w:val="en-US"/>
+        </w:rPr>
+        <w:t>:</w:t>
+      </w:r>
+    </w:p>
+    <w:p>
+      <w:pPr>
+        <w:rPr>
+          <w:lang w:val="en-US"/>
+        </w:rPr>
+      </w:pPr>
+      <w:r>
+        <w:rPr>
+          <w:lang w:val="en-US"/>
+        </w:rPr>
+        <w:t>Excavation using an auger</w:t>
+      </w:r>
+    </w:p>
+    <w:p>
+      <w:pPr>
+        <w:rPr>
+          <w:lang w:val="en-US"/>
+        </w:rPr>
+      </w:pPr>
+      <w:r>
+        <w:rPr>
+          <w:lang w:val="en-US"/>
+        </w:rPr>
+        <w:t>Hire of a HIAB lorry with driver/operator</w:t>
+      </w:r>
+    </w:p>
+    <w:p>
+      <w:pPr>
+        <w:ind w:left="360"/>
+        <w:rPr>
+          <w:lang w:val="en-US"/>
+        </w:rPr>
+      </w:pPr>
     </w:p>
     <w:p>
       <w:pPr>
@@ -1043,6 +1368,92 @@
 <file path=word/numbering.xml><?xml version="1.0" encoding="utf-8"?>
 <w:numbering xmlns:wpc="http://schemas.microsoft.com/office/word/2010/wordprocessingCanvas" xmlns:mc="http://schemas.openxmlformats.org/markup-compatibility/2006" xmlns:o="urn:schemas-microsoft-com:office:office" xmlns:r="http://schemas.openxmlformats.org/officeDocument/2006/relationships" xmlns:m="http://schemas.openxmlformats.org/officeDocument/2006/math" xmlns:v="urn:schemas-microsoft-com:vml" xmlns:wp14="http://schemas.microsoft.com/office/word/2010/wordprocessingDrawing" xmlns:wp="http://schemas.openxmlformats.org/drawingml/2006/wordprocessingDrawing" xmlns:w10="urn:schemas-microsoft-com:office:word" xmlns:w="http://schemas.openxmlformats.org/wordprocessingml/2006/main" xmlns:w14="http://schemas.microsoft.com/office/word/2010/wordml" xmlns:wpg="http://schemas.microsoft.com/office/word/2010/wordprocessingGroup" xmlns:wpi="http://schemas.microsoft.com/office/word/2010/wordprocessingInk" xmlns:wne="http://schemas.microsoft.com/office/word/2006/wordml" xmlns:wps="http://schemas.microsoft.com/office/word/2010/wordprocessingShape" mc:Ignorable="w14 wp14">
   <w:abstractNum w:abstractNumId="0">
+    <w:nsid w:val="1FA36235"/>
+    <w:multiLevelType w:val="hybridMultilevel"/>
+    <w:tmpl w:val="14A4559C"/>
+    <w:lvl w:ilvl="0" w:tplc="0809000F">
+      <w:start w:val="1"/>
+      <w:numFmt w:val="decimal"/>
+      <w:lvlText w:val="%1."/>
+      <w:lvlJc w:val="left"/>
+      <w:pPr>
+        <w:ind w:left="360" w:hanging="360"/>
+      </w:pPr>
+    </w:lvl>
+    <w:lvl w:ilvl="1" w:tplc="08090019" w:tentative="1">
+      <w:start w:val="1"/>
+      <w:numFmt w:val="lowerLetter"/>
+      <w:lvlText w:val="%2."/>
+      <w:lvlJc w:val="left"/>
+      <w:pPr>
+        <w:ind w:left="1080" w:hanging="360"/>
+      </w:pPr>
+    </w:lvl>
+    <w:lvl w:ilvl="2" w:tplc="0809001B" w:tentative="1">
+      <w:start w:val="1"/>
+      <w:numFmt w:val="lowerRoman"/>
+      <w:lvlText w:val="%3."/>
+      <w:lvlJc w:val="right"/>
+      <w:pPr>
+        <w:ind w:left="1800" w:hanging="180"/>
+      </w:pPr>
+    </w:lvl>
+    <w:lvl w:ilvl="3" w:tplc="0809000F" w:tentative="1">
+      <w:start w:val="1"/>
+      <w:numFmt w:val="decimal"/>
+      <w:lvlText w:val="%4."/>
+      <w:lvlJc w:val="left"/>
+      <w:pPr>
+        <w:ind w:left="2520" w:hanging="360"/>
+      </w:pPr>
+    </w:lvl>
+    <w:lvl w:ilvl="4" w:tplc="08090019" w:tentative="1">
+      <w:start w:val="1"/>
+      <w:numFmt w:val="lowerLetter"/>
+      <w:lvlText w:val="%5."/>
+      <w:lvlJc w:val="left"/>
+      <w:pPr>
+        <w:ind w:left="3240" w:hanging="360"/>
+      </w:pPr>
+    </w:lvl>
+    <w:lvl w:ilvl="5" w:tplc="0809001B" w:tentative="1">
+      <w:start w:val="1"/>
+      <w:numFmt w:val="lowerRoman"/>
+      <w:lvlText w:val="%6."/>
+      <w:lvlJc w:val="right"/>
+      <w:pPr>
+        <w:ind w:left="3960" w:hanging="180"/>
+      </w:pPr>
+    </w:lvl>
+    <w:lvl w:ilvl="6" w:tplc="0809000F" w:tentative="1">
+      <w:start w:val="1"/>
+      <w:numFmt w:val="decimal"/>
+      <w:lvlText w:val="%7."/>
+      <w:lvlJc w:val="left"/>
+      <w:pPr>
+        <w:ind w:left="4680" w:hanging="360"/>
+      </w:pPr>
+    </w:lvl>
+    <w:lvl w:ilvl="7" w:tplc="08090019" w:tentative="1">
+      <w:start w:val="1"/>
+      <w:numFmt w:val="lowerLetter"/>
+      <w:lvlText w:val="%8."/>
+      <w:lvlJc w:val="left"/>
+      <w:pPr>
+        <w:ind w:left="5400" w:hanging="360"/>
+      </w:pPr>
+    </w:lvl>
+    <w:lvl w:ilvl="8" w:tplc="0809001B" w:tentative="1">
+      <w:start w:val="1"/>
+      <w:numFmt w:val="lowerRoman"/>
+      <w:lvlText w:val="%9."/>
+      <w:lvlJc w:val="right"/>
+      <w:pPr>
+        <w:ind w:left="6120" w:hanging="180"/>
+      </w:pPr>
+    </w:lvl>
+  </w:abstractNum>
+  <w:abstractNum w:abstractNumId="1">
     <w:nsid w:val="639100D9"/>
     <w:multiLevelType w:val="hybridMultilevel"/>
     <w:tmpl w:val="88E2C9E0"/>
@@ -1155,7 +1566,215 @@
       </w:rPr>
     </w:lvl>
   </w:abstractNum>
+  <w:abstractNum w:abstractNumId="2">
+    <w:nsid w:val="6B9C041F"/>
+    <w:multiLevelType w:val="hybridMultilevel"/>
+    <w:tmpl w:val="B4747D66"/>
+    <w:lvl w:ilvl="0" w:tplc="08090001">
+      <w:start w:val="1"/>
+      <w:numFmt w:val="bullet"/>
+      <w:lvlText w:val=""/>
+      <w:lvlJc w:val="left"/>
+      <w:pPr>
+        <w:ind w:left="720" w:hanging="360"/>
+      </w:pPr>
+      <w:rPr>
+        <w:rFonts w:ascii="Symbol" w:hAnsi="Symbol" w:hint="default"/>
+      </w:rPr>
+    </w:lvl>
+    <w:lvl w:ilvl="1" w:tplc="08090003" w:tentative="1">
+      <w:start w:val="1"/>
+      <w:numFmt w:val="bullet"/>
+      <w:lvlText w:val="o"/>
+      <w:lvlJc w:val="left"/>
+      <w:pPr>
+        <w:ind w:left="1440" w:hanging="360"/>
+      </w:pPr>
+      <w:rPr>
+        <w:rFonts w:ascii="Courier New" w:hAnsi="Courier New" w:cs="Courier New" w:hint="default"/>
+      </w:rPr>
+    </w:lvl>
+    <w:lvl w:ilvl="2" w:tplc="08090005" w:tentative="1">
+      <w:start w:val="1"/>
+      <w:numFmt w:val="bullet"/>
+      <w:lvlText w:val=""/>
+      <w:lvlJc w:val="left"/>
+      <w:pPr>
+        <w:ind w:left="2160" w:hanging="360"/>
+      </w:pPr>
+      <w:rPr>
+        <w:rFonts w:ascii="Wingdings" w:hAnsi="Wingdings" w:hint="default"/>
+      </w:rPr>
+    </w:lvl>
+    <w:lvl w:ilvl="3" w:tplc="08090001" w:tentative="1">
+      <w:start w:val="1"/>
+      <w:numFmt w:val="bullet"/>
+      <w:lvlText w:val=""/>
+      <w:lvlJc w:val="left"/>
+      <w:pPr>
+        <w:ind w:left="2880" w:hanging="360"/>
+      </w:pPr>
+      <w:rPr>
+        <w:rFonts w:ascii="Symbol" w:hAnsi="Symbol" w:hint="default"/>
+      </w:rPr>
+    </w:lvl>
+    <w:lvl w:ilvl="4" w:tplc="08090003" w:tentative="1">
+      <w:start w:val="1"/>
+      <w:numFmt w:val="bullet"/>
+      <w:lvlText w:val="o"/>
+      <w:lvlJc w:val="left"/>
+      <w:pPr>
+        <w:ind w:left="3600" w:hanging="360"/>
+      </w:pPr>
+      <w:rPr>
+        <w:rFonts w:ascii="Courier New" w:hAnsi="Courier New" w:cs="Courier New" w:hint="default"/>
+      </w:rPr>
+    </w:lvl>
+    <w:lvl w:ilvl="5" w:tplc="08090005" w:tentative="1">
+      <w:start w:val="1"/>
+      <w:numFmt w:val="bullet"/>
+      <w:lvlText w:val=""/>
+      <w:lvlJc w:val="left"/>
+      <w:pPr>
+        <w:ind w:left="4320" w:hanging="360"/>
+      </w:pPr>
+      <w:rPr>
+        <w:rFonts w:ascii="Wingdings" w:hAnsi="Wingdings" w:hint="default"/>
+      </w:rPr>
+    </w:lvl>
+    <w:lvl w:ilvl="6" w:tplc="08090001" w:tentative="1">
+      <w:start w:val="1"/>
+      <w:numFmt w:val="bullet"/>
+      <w:lvlText w:val=""/>
+      <w:lvlJc w:val="left"/>
+      <w:pPr>
+        <w:ind w:left="5040" w:hanging="360"/>
+      </w:pPr>
+      <w:rPr>
+        <w:rFonts w:ascii="Symbol" w:hAnsi="Symbol" w:hint="default"/>
+      </w:rPr>
+    </w:lvl>
+    <w:lvl w:ilvl="7" w:tplc="08090003" w:tentative="1">
+      <w:start w:val="1"/>
+      <w:numFmt w:val="bullet"/>
+      <w:lvlText w:val="o"/>
+      <w:lvlJc w:val="left"/>
+      <w:pPr>
+        <w:ind w:left="5760" w:hanging="360"/>
+      </w:pPr>
+      <w:rPr>
+        <w:rFonts w:ascii="Courier New" w:hAnsi="Courier New" w:cs="Courier New" w:hint="default"/>
+      </w:rPr>
+    </w:lvl>
+    <w:lvl w:ilvl="8" w:tplc="08090005" w:tentative="1">
+      <w:start w:val="1"/>
+      <w:numFmt w:val="bullet"/>
+      <w:lvlText w:val=""/>
+      <w:lvlJc w:val="left"/>
+      <w:pPr>
+        <w:ind w:left="6480" w:hanging="360"/>
+      </w:pPr>
+      <w:rPr>
+        <w:rFonts w:ascii="Wingdings" w:hAnsi="Wingdings" w:hint="default"/>
+      </w:rPr>
+    </w:lvl>
+  </w:abstractNum>
+  <w:abstractNum w:abstractNumId="3">
+    <w:nsid w:val="7D7D6596"/>
+    <w:multiLevelType w:val="hybridMultilevel"/>
+    <w:tmpl w:val="74766CCE"/>
+    <w:lvl w:ilvl="0" w:tplc="0809000F">
+      <w:start w:val="1"/>
+      <w:numFmt w:val="decimal"/>
+      <w:lvlText w:val="%1."/>
+      <w:lvlJc w:val="left"/>
+      <w:pPr>
+        <w:ind w:left="360" w:hanging="360"/>
+      </w:pPr>
+    </w:lvl>
+    <w:lvl w:ilvl="1" w:tplc="08090019" w:tentative="1">
+      <w:start w:val="1"/>
+      <w:numFmt w:val="lowerLetter"/>
+      <w:lvlText w:val="%2."/>
+      <w:lvlJc w:val="left"/>
+      <w:pPr>
+        <w:ind w:left="1080" w:hanging="360"/>
+      </w:pPr>
+    </w:lvl>
+    <w:lvl w:ilvl="2" w:tplc="0809001B" w:tentative="1">
+      <w:start w:val="1"/>
+      <w:numFmt w:val="lowerRoman"/>
+      <w:lvlText w:val="%3."/>
+      <w:lvlJc w:val="right"/>
+      <w:pPr>
+        <w:ind w:left="1800" w:hanging="180"/>
+      </w:pPr>
+    </w:lvl>
+    <w:lvl w:ilvl="3" w:tplc="0809000F" w:tentative="1">
+      <w:start w:val="1"/>
+      <w:numFmt w:val="decimal"/>
+      <w:lvlText w:val="%4."/>
+      <w:lvlJc w:val="left"/>
+      <w:pPr>
+        <w:ind w:left="2520" w:hanging="360"/>
+      </w:pPr>
+    </w:lvl>
+    <w:lvl w:ilvl="4" w:tplc="08090019" w:tentative="1">
+      <w:start w:val="1"/>
+      <w:numFmt w:val="lowerLetter"/>
+      <w:lvlText w:val="%5."/>
+      <w:lvlJc w:val="left"/>
+      <w:pPr>
+        <w:ind w:left="3240" w:hanging="360"/>
+      </w:pPr>
+    </w:lvl>
+    <w:lvl w:ilvl="5" w:tplc="0809001B" w:tentative="1">
+      <w:start w:val="1"/>
+      <w:numFmt w:val="lowerRoman"/>
+      <w:lvlText w:val="%6."/>
+      <w:lvlJc w:val="right"/>
+      <w:pPr>
+        <w:ind w:left="3960" w:hanging="180"/>
+      </w:pPr>
+    </w:lvl>
+    <w:lvl w:ilvl="6" w:tplc="0809000F" w:tentative="1">
+      <w:start w:val="1"/>
+      <w:numFmt w:val="decimal"/>
+      <w:lvlText w:val="%7."/>
+      <w:lvlJc w:val="left"/>
+      <w:pPr>
+        <w:ind w:left="4680" w:hanging="360"/>
+      </w:pPr>
+    </w:lvl>
+    <w:lvl w:ilvl="7" w:tplc="08090019" w:tentative="1">
+      <w:start w:val="1"/>
+      <w:numFmt w:val="lowerLetter"/>
+      <w:lvlText w:val="%8."/>
+      <w:lvlJc w:val="left"/>
+      <w:pPr>
+        <w:ind w:left="5400" w:hanging="360"/>
+      </w:pPr>
+    </w:lvl>
+    <w:lvl w:ilvl="8" w:tplc="0809001B" w:tentative="1">
+      <w:start w:val="1"/>
+      <w:numFmt w:val="lowerRoman"/>
+      <w:lvlText w:val="%9."/>
+      <w:lvlJc w:val="right"/>
+      <w:pPr>
+        <w:ind w:left="6120" w:hanging="180"/>
+      </w:pPr>
+    </w:lvl>
+  </w:abstractNum>
   <w:num w:numId="1">
+    <w:abstractNumId w:val="1"/>
+  </w:num>
+  <w:num w:numId="2">
+    <w:abstractNumId w:val="3"/>
+  </w:num>
+  <w:num w:numId="3">
+    <w:abstractNumId w:val="2"/>
+  </w:num>
+  <w:num w:numId="4">
     <w:abstractNumId w:val="0"/>
   </w:num>
 </w:numbering>

</xml_diff>